<commit_message>
Add/update zht data for UWTranslationNotes
</commit_message>
<xml_diff>
--- a/zht/docx/06.content.docx
+++ b/zht/docx/06.content.docx
@@ -5584,19 +5584,7 @@
         <w:rPr>
           <w:lang w:val="zh_TW" w:bidi="zh_TW"/>
         </w:rPr>
-        <w:t>和</w:t>
-      </w:r>
-      <w:r>
-        <w:rPr>
-          <w:lang w:val="zh_TW" w:bidi="zh_TW"/>
-        </w:rPr>
-        <w:t>血</w:t>
-      </w:r>
-      <w:r>
-        <w:rPr>
-          <w:lang w:val="zh_TW" w:bidi="zh_TW"/>
-        </w:rPr>
-        <w:t>）</w:t>
+        <w:t>和血）</w:t>
       </w:r>
     </w:p>
     <w:p>

</xml_diff>